<commit_message>
adding Contact.cpp instructon for include\ instruction.docx file
</commit_message>
<xml_diff>
--- a/include/include instruction.docx
+++ b/include/include instruction.docx
@@ -813,8 +813,263 @@
     <w:p>
       <w:pPr>
         <w:rPr>
-          <w:rFonts w:cs="B Nazanin" w:hint="cs"/>
-          <w:rtl/>
+          <w:rFonts w:cs="B Nazanin"/>
+          <w:rtl/>
+        </w:rPr>
+      </w:pPr>
+    </w:p>
+    <w:p>
+      <w:pPr>
+        <w:shd w:val="clear" w:color="auto" w:fill="FFFFFF"/>
+        <w:spacing w:after="240" w:line="480" w:lineRule="atLeast"/>
+        <w:outlineLvl w:val="1"/>
+        <w:rPr>
+          <w:rFonts w:ascii="Segoe UI" w:eastAsia="Times New Roman" w:hAnsi="Segoe UI" w:cs="Segoe UI"/>
+          <w:b/>
+          <w:bCs/>
+          <w:color w:val="0F1115"/>
+          <w:sz w:val="33"/>
+          <w:szCs w:val="33"/>
+          <w14:ligatures w14:val="none"/>
+        </w:rPr>
+      </w:pPr>
+      <w:r>
+        <w:rPr>
+          <w:rFonts w:ascii="Segoe UI" w:eastAsia="Times New Roman" w:hAnsi="Segoe UI" w:cs="B Nazanin"/>
+          <w:b/>
+          <w:bCs/>
+          <w:color w:val="0F1115"/>
+          <w:sz w:val="24"/>
+          <w:szCs w:val="24"/>
+          <w14:ligatures w14:val="none"/>
+        </w:rPr>
+        <w:t>Contact.cpp</w:t>
+      </w:r>
+      <w:r>
+        <w:rPr>
+          <w:rFonts w:ascii="Segoe UI" w:eastAsia="Times New Roman" w:hAnsi="Segoe UI" w:cs="Segoe UI"/>
+          <w:b/>
+          <w:bCs/>
+          <w:color w:val="0F1115"/>
+          <w:sz w:val="33"/>
+          <w:szCs w:val="33"/>
+          <w14:ligatures w14:val="none"/>
+        </w:rPr>
+        <w:t> </w:t>
+      </w:r>
+      <w:r>
+        <w:rPr>
+          <w:rFonts w:ascii="Segoe UI" w:eastAsia="Times New Roman" w:hAnsi="Segoe UI" w:cs="Segoe UI"/>
+          <w:b/>
+          <w:bCs/>
+          <w:color w:val="0F1115"/>
+          <w:sz w:val="33"/>
+          <w:szCs w:val="33"/>
+          <w:rtl/>
+          <w14:ligatures w14:val="none"/>
+        </w:rPr>
+        <w:t>چیکار میکنه؟ (خلاصه)</w:t>
+      </w:r>
+    </w:p>
+    <w:p>
+      <w:pPr>
+        <w:shd w:val="clear" w:color="auto" w:fill="FFFFFF"/>
+        <w:spacing w:before="240" w:after="240" w:line="240" w:lineRule="auto"/>
+        <w:rPr>
+          <w:rFonts w:ascii="Segoe UI" w:eastAsia="Times New Roman" w:hAnsi="Segoe UI" w:cs="Segoe UI"/>
+          <w:color w:val="0F1115"/>
+          <w:sz w:val="24"/>
+          <w:szCs w:val="24"/>
+          <w:rtl/>
+          <w14:ligatures w14:val="none"/>
+        </w:rPr>
+      </w:pPr>
+      <w:r>
+        <w:rPr>
+          <w:rFonts w:ascii="Segoe UI" w:eastAsia="Times New Roman" w:hAnsi="Segoe UI" w:cs="Segoe UI"/>
+          <w:color w:val="0F1115"/>
+          <w:sz w:val="24"/>
+          <w:szCs w:val="24"/>
+          <w:rtl/>
+          <w14:ligatures w14:val="none"/>
+        </w:rPr>
+        <w:t>این فایل </w:t>
+      </w:r>
+      <w:r>
+        <w:rPr>
+          <w:rFonts w:ascii="Segoe UI" w:eastAsia="Times New Roman" w:hAnsi="Segoe UI" w:cs="Segoe UI"/>
+          <w:b/>
+          <w:bCs/>
+          <w:color w:val="0F1115"/>
+          <w:sz w:val="24"/>
+          <w:szCs w:val="24"/>
+          <w:rtl/>
+          <w14:ligatures w14:val="none"/>
+        </w:rPr>
+        <w:t>عملیات‌های واقعی</w:t>
+      </w:r>
+      <w:r>
+        <w:rPr>
+          <w:rFonts w:ascii="Segoe UI" w:eastAsia="Times New Roman" w:hAnsi="Segoe UI" w:cs="Segoe UI"/>
+          <w:color w:val="0F1115"/>
+          <w:sz w:val="24"/>
+          <w:szCs w:val="24"/>
+          <w:rtl/>
+          <w14:ligatures w14:val="none"/>
+        </w:rPr>
+        <w:t> کلاس </w:t>
+      </w:r>
+      <w:r>
+        <w:rPr>
+          <w:rFonts w:ascii="Consolas" w:eastAsia="Times New Roman" w:hAnsi="Consolas" w:cs="Courier New"/>
+          <w:color w:val="0F1115"/>
+          <w:sz w:val="21"/>
+          <w:szCs w:val="21"/>
+          <w:shd w:val="clear" w:color="auto" w:fill="EBEEF2"/>
+          <w14:ligatures w14:val="none"/>
+        </w:rPr>
+        <w:t>Contact</w:t>
+      </w:r>
+      <w:r>
+        <w:rPr>
+          <w:rFonts w:ascii="Segoe UI" w:eastAsia="Times New Roman" w:hAnsi="Segoe UI" w:cs="Segoe UI"/>
+          <w:color w:val="0F1115"/>
+          <w:sz w:val="24"/>
+          <w:szCs w:val="24"/>
+          <w14:ligatures w14:val="none"/>
+        </w:rPr>
+        <w:t> </w:t>
+      </w:r>
+      <w:r>
+        <w:rPr>
+          <w:rFonts w:ascii="Segoe UI" w:eastAsia="Times New Roman" w:hAnsi="Segoe UI" w:cs="Segoe UI"/>
+          <w:color w:val="0F1115"/>
+          <w:sz w:val="24"/>
+          <w:szCs w:val="24"/>
+          <w:rtl/>
+          <w14:ligatures w14:val="none"/>
+        </w:rPr>
+        <w:t>رو انجام میده. یعنی همون چیزهایی که در </w:t>
+      </w:r>
+      <w:proofErr w:type="spellStart"/>
+      <w:r>
+        <w:rPr>
+          <w:rFonts w:ascii="Segoe UI" w:eastAsia="Times New Roman" w:hAnsi="Segoe UI" w:cs="B Nazanin"/>
+          <w:b/>
+          <w:bCs/>
+          <w:color w:val="0F1115"/>
+          <w:sz w:val="24"/>
+          <w:szCs w:val="24"/>
+          <w14:ligatures w14:val="none"/>
+        </w:rPr>
+        <w:t>Contact.h</w:t>
+      </w:r>
+      <w:proofErr w:type="spellEnd"/>
+      <w:r>
+        <w:rPr>
+          <w:rFonts w:ascii="Segoe UI" w:eastAsia="Times New Roman" w:hAnsi="Segoe UI" w:cs="Segoe UI"/>
+          <w:color w:val="0F1115"/>
+          <w:sz w:val="24"/>
+          <w:szCs w:val="24"/>
+          <w14:ligatures w14:val="none"/>
+        </w:rPr>
+        <w:t> </w:t>
+      </w:r>
+      <w:r>
+        <w:rPr>
+          <w:rFonts w:ascii="Segoe UI" w:eastAsia="Times New Roman" w:hAnsi="Segoe UI" w:cs="Segoe UI"/>
+          <w:color w:val="0F1115"/>
+          <w:sz w:val="24"/>
+          <w:szCs w:val="24"/>
+          <w:rtl/>
+          <w14:ligatures w14:val="none"/>
+        </w:rPr>
+        <w:t>فقط </w:t>
+      </w:r>
+      <w:r>
+        <w:rPr>
+          <w:rFonts w:ascii="Segoe UI" w:eastAsia="Times New Roman" w:hAnsi="Segoe UI" w:cs="Segoe UI"/>
+          <w:b/>
+          <w:bCs/>
+          <w:color w:val="0F1115"/>
+          <w:sz w:val="24"/>
+          <w:szCs w:val="24"/>
+          <w:rtl/>
+          <w14:ligatures w14:val="none"/>
+        </w:rPr>
+        <w:t>قولش</w:t>
+      </w:r>
+      <w:r>
+        <w:rPr>
+          <w:rFonts w:ascii="Segoe UI" w:eastAsia="Times New Roman" w:hAnsi="Segoe UI" w:cs="Segoe UI"/>
+          <w:color w:val="0F1115"/>
+          <w:sz w:val="24"/>
+          <w:szCs w:val="24"/>
+          <w:rtl/>
+          <w14:ligatures w14:val="none"/>
+        </w:rPr>
+        <w:t> رو داده بودیم، اینجا </w:t>
+      </w:r>
+      <w:r>
+        <w:rPr>
+          <w:rFonts w:ascii="Segoe UI" w:eastAsia="Times New Roman" w:hAnsi="Segoe UI" w:cs="Segoe UI"/>
+          <w:b/>
+          <w:bCs/>
+          <w:color w:val="0F1115"/>
+          <w:sz w:val="24"/>
+          <w:szCs w:val="24"/>
+          <w:rtl/>
+          <w14:ligatures w14:val="none"/>
+        </w:rPr>
+        <w:t>اجراش</w:t>
+      </w:r>
+      <w:r>
+        <w:rPr>
+          <w:rFonts w:ascii="Segoe UI" w:eastAsia="Times New Roman" w:hAnsi="Segoe UI" w:cs="Segoe UI"/>
+          <w:color w:val="0F1115"/>
+          <w:sz w:val="24"/>
+          <w:szCs w:val="24"/>
+          <w:rtl/>
+          <w14:ligatures w14:val="none"/>
+        </w:rPr>
+        <w:t> میکنیم</w:t>
+      </w:r>
+      <w:r>
+        <w:rPr>
+          <w:rFonts w:ascii="Segoe UI" w:eastAsia="Times New Roman" w:hAnsi="Segoe UI" w:cs="Segoe UI"/>
+          <w:color w:val="0F1115"/>
+          <w:sz w:val="24"/>
+          <w:szCs w:val="24"/>
+          <w14:ligatures w14:val="none"/>
+        </w:rPr>
+        <w:t>.</w:t>
+      </w:r>
+    </w:p>
+    <w:p>
+      <w:pPr>
+        <w:shd w:val="clear" w:color="auto" w:fill="FFFFFF"/>
+        <w:spacing w:before="240" w:after="240" w:line="240" w:lineRule="auto"/>
+        <w:rPr>
+          <w:rFonts w:ascii="Segoe UI" w:eastAsia="Times New Roman" w:hAnsi="Segoe UI" w:cs="Segoe UI"/>
+          <w:color w:val="0F1115"/>
+          <w:sz w:val="24"/>
+          <w:szCs w:val="24"/>
+          <w:rtl/>
+          <w14:ligatures w14:val="none"/>
+        </w:rPr>
+      </w:pPr>
+    </w:p>
+    <w:p>
+      <w:pPr>
+        <w:shd w:val="clear" w:color="auto" w:fill="FFFFFF"/>
+        <w:spacing w:before="240" w:after="240" w:line="240" w:lineRule="auto"/>
+        <w:rPr>
+          <w:rFonts w:ascii="Segoe UI" w:eastAsia="Times New Roman" w:hAnsi="Segoe UI" w:cs="Segoe UI" w:hint="cs"/>
+          <w:color w:val="0F1115"/>
+          <w:sz w:val="24"/>
+          <w:szCs w:val="24"/>
+          <w:rtl/>
+          <w14:ligatures w14:val="none"/>
         </w:rPr>
       </w:pPr>
     </w:p>

</xml_diff>